<commit_message>
Add detailed Fidar Technology Fartak co-founder experience
</commit_message>
<xml_diff>
--- a/public/resumes/Mehrad-Yaghoubi-AI-Engineering-Resume.docx
+++ b/public/resumes/Mehrad-Yaghoubi-AI-Engineering-Resume.docx
@@ -182,6 +182,36 @@
           <w:sz w:val="18"/>
         </w:rPr>
         <w:t>Robotics Instructor | Mohandesin Bartar Institute | 1 year</w:t>
+      </w:r>
+    </w:p>
+    <w:p>
+      <w:pPr>
+        <w:pStyle w:val="Heading1"/>
+      </w:pPr>
+      <w:r>
+        <w:t>ENTREPRENEURIAL EXPERIENCE</w:t>
+      </w:r>
+    </w:p>
+    <w:p>
+      <w:pPr>
+        <w:keepLines/>
+      </w:pPr>
+      <w:r>
+        <w:rPr>
+          <w:sz w:val="18"/>
+        </w:rPr>
+        <w:t>Co-founder and sole programmer | Fidar Technology Fartak — university-level venture, not incorporated | 1.5 years</w:t>
+      </w:r>
+    </w:p>
+    <w:p>
+      <w:pPr>
+        <w:keepLines/>
+      </w:pPr>
+      <w:r>
+        <w:rPr>
+          <w:sz w:val="18"/>
+        </w:rPr>
+        <w:t>One of three core team members and the only programmer, working on psychology-informed games intended to help prevent crime.</w:t>
       </w:r>
     </w:p>
     <w:p>

</xml_diff>

<commit_message>
Refine bilingual writing and add Persian work resume
</commit_message>
<xml_diff>
--- a/public/resumes/Mehrad-Yaghoubi-AI-Engineering-Resume.docx
+++ b/public/resumes/Mehrad-Yaghoubi-AI-Engineering-Resume.docx
@@ -5,34 +5,58 @@
     <w:p>
       <w:pPr>
         <w:pStyle w:val="Title"/>
-        <w:spacing w:after="20"/>
       </w:pPr>
       <w:r>
+        <w:rPr>
+          <w:rFonts w:ascii="Arial" w:hAnsi="Arial" w:cs="Arial"/>
+          <w:b/>
+          <w:color w:val="000000"/>
+          <w:sz w:val="46"/>
+          <w:lang w:val="en-US" w:bidi="en-US"/>
+        </w:rPr>
         <w:t>Mehrad Yaghoubi</w:t>
       </w:r>
     </w:p>
     <w:p>
-      <w:pPr>
-        <w:spacing w:after="180"/>
-      </w:pPr>
       <w:r>
         <w:rPr>
+          <w:rFonts w:ascii="Arial" w:hAnsi="Arial" w:cs="Arial"/>
           <w:b/>
-          <w:color w:val="497790"/>
-          <w:sz w:val="20"/>
+          <w:color w:val="1B2C3B"/>
+          <w:sz w:val="23"/>
+          <w:lang w:val="en-US" w:bidi="en-US"/>
         </w:rPr>
-        <w:t>AI ENGINEERING RESUME</w:t>
+        <w:t>AI engineering resume</w:t>
       </w:r>
     </w:p>
     <w:p>
       <w:pPr>
-        <w:spacing w:after="180"/>
+        <w:spacing w:after="60"/>
       </w:pPr>
       <w:r>
         <w:rPr>
-          <w:sz w:val="16"/>
+          <w:rFonts w:ascii="Arial" w:hAnsi="Arial" w:cs="Arial"/>
+          <w:b w:val="0"/>
+          <w:color w:val="1B2C3B"/>
+          <w:sz w:val="17"/>
+          <w:lang w:val="en-US" w:bidi="en-US"/>
         </w:rPr>
-        <w:t>mehradyaghoubi96@gmail.com  |  Karaj, Iran  |  mehradyaghoubi.github.io  |  linkedin.com/in/mehrad-yaghoubi  |  github.com/MehradYaghoubi</w:t>
+        <w:t>Karaj, Iran | mehradyaghoubi96@gmail.com</w:t>
+      </w:r>
+    </w:p>
+    <w:p>
+      <w:pPr>
+        <w:spacing w:after="60"/>
+      </w:pPr>
+      <w:r>
+        <w:rPr>
+          <w:rFonts w:ascii="Arial" w:hAnsi="Arial" w:cs="Arial"/>
+          <w:b w:val="0"/>
+          <w:color w:val="1B2C3B"/>
+          <w:sz w:val="17"/>
+          <w:lang w:val="en-US" w:bidi="en-US"/>
+        </w:rPr>
+        <w:t>https://mehradyaghoubi.github.io/ | https://github.com/MehradYaghoubi | https://www.linkedin.com/in/mehrad-yaghoubi</w:t>
       </w:r>
     </w:p>
     <w:p>
@@ -40,7 +64,14 @@
         <w:pStyle w:val="Heading1"/>
       </w:pPr>
       <w:r>
-        <w:t>PROFILE</w:t>
+        <w:rPr>
+          <w:rFonts w:ascii="Arial" w:hAnsi="Arial" w:cs="Arial"/>
+          <w:b/>
+          <w:color w:val="1B2C3B"/>
+          <w:sz w:val="23"/>
+          <w:lang w:val="en-US" w:bidi="en-US"/>
+        </w:rPr>
+        <w:t>Profile</w:t>
       </w:r>
     </w:p>
     <w:p>
@@ -49,9 +80,13 @@
       </w:pPr>
       <w:r>
         <w:rPr>
-          <w:sz w:val="18"/>
+          <w:rFonts w:ascii="Arial" w:hAnsi="Arial" w:cs="Arial"/>
+          <w:b w:val="0"/>
+          <w:color w:val="1B2C3B"/>
+          <w:sz w:val="21"/>
+          <w:lang w:val="en-US" w:bidi="en-US"/>
         </w:rPr>
-        <w:t>AI specialist with hands-on experience building a Persian travel chatbot, WordPress integrations, price-checking automation and an operator training dashboard. Combines applied software delivery with M.Sc. research in PyTorch computer vision and efficient inference.</w:t>
+        <w:t>AI specialist with experience developing a Persian travel chatbot, WordPress plugins and automation tools. M.Sc. research focuses on visual speech recognition with PyTorch and efficient model inference.</w:t>
       </w:r>
     </w:p>
     <w:p>
@@ -59,7 +94,14 @@
         <w:pStyle w:val="Heading1"/>
       </w:pPr>
       <w:r>
-        <w:t>EXPERIENCE</w:t>
+        <w:rPr>
+          <w:rFonts w:ascii="Arial" w:hAnsi="Arial" w:cs="Arial"/>
+          <w:b/>
+          <w:color w:val="1B2C3B"/>
+          <w:sz w:val="23"/>
+          <w:lang w:val="en-US" w:bidi="en-US"/>
+        </w:rPr>
+        <w:t>Technical skills</w:t>
       </w:r>
     </w:p>
     <w:p>
@@ -68,45 +110,28 @@
       </w:pPr>
       <w:r>
         <w:rPr>
-          <w:sz w:val="18"/>
+          <w:rFonts w:ascii="Arial" w:hAnsi="Arial" w:cs="Arial"/>
+          <w:b w:val="0"/>
+          <w:color w:val="1B2C3B"/>
+          <w:sz w:val="21"/>
+          <w:lang w:val="en-US" w:bidi="en-US"/>
         </w:rPr>
-        <w:t>AI Specialist | Ghasedak Peik Shahr | 2026 (2 months)</w:t>
+        <w:t>Python, PyTorch, TorchVision, OpenCV, MediaPipe, NumPy, Pandas, scikit-learn, Git, Linux, FastAPI, REST APIs, WordPress</w:t>
       </w:r>
     </w:p>
     <w:p>
       <w:pPr>
-        <w:keepLines/>
-        <w:ind w:left="202" w:hanging="202"/>
+        <w:pStyle w:val="Heading1"/>
       </w:pPr>
       <w:r>
         <w:rPr>
-          <w:sz w:val="18"/>
+          <w:rFonts w:ascii="Arial" w:hAnsi="Arial" w:cs="Arial"/>
+          <w:b/>
+          <w:color w:val="1B2C3B"/>
+          <w:sz w:val="23"/>
+          <w:lang w:val="en-US" w:bidi="en-US"/>
         </w:rPr>
-        <w:t>• Developed a Persian travel-booking chatbot with three WordPress plugins/integrations.</w:t>
-      </w:r>
-    </w:p>
-    <w:p>
-      <w:pPr>
-        <w:keepLines/>
-        <w:ind w:left="202" w:hanging="202"/>
-      </w:pPr>
-      <w:r>
-        <w:rPr>
-          <w:sz w:val="18"/>
-        </w:rPr>
-        <w:t>• Built a bot to check competitor prices.</w:t>
-      </w:r>
-    </w:p>
-    <w:p>
-      <w:pPr>
-        <w:keepLines/>
-        <w:ind w:left="202" w:hanging="202"/>
-      </w:pPr>
-      <w:r>
-        <w:rPr>
-          <w:sz w:val="18"/>
-        </w:rPr>
-        <w:t>• Created an operator training dashboard and a custom homepage theme for Parsegasht.</w:t>
+        <w:t>Professional experience</w:t>
       </w:r>
     </w:p>
     <w:p>
@@ -115,8 +140,23 @@
       </w:pPr>
       <w:r>
         <w:rPr>
-          <w:sz w:val="18"/>
+          <w:rFonts w:ascii="Arial" w:hAnsi="Arial" w:cs="Arial"/>
+          <w:b/>
+          <w:color w:val="1B2C3B"/>
+          <w:sz w:val="21"/>
+          <w:lang w:val="en-US" w:bidi="en-US"/>
         </w:rPr>
+        <w:t>AI Specialist</w:t>
+      </w:r>
+      <w:r>
+        <w:rPr>
+          <w:rFonts w:ascii="Arial" w:hAnsi="Arial" w:cs="Arial"/>
+          <w:b w:val="0"/>
+          <w:color w:val="1B2C3B"/>
+          <w:sz w:val="21"/>
+          <w:lang w:val="en-US" w:bidi="en-US"/>
+        </w:rPr>
+        <w:t xml:space="preserve"> | Ghasedak Peik Shahr | 2026 · 2 months</w:t>
       </w:r>
     </w:p>
     <w:p>
@@ -125,9 +165,13 @@
       </w:pPr>
       <w:r>
         <w:rPr>
-          <w:sz w:val="18"/>
+          <w:rFonts w:ascii="Arial" w:hAnsi="Arial" w:cs="Arial"/>
+          <w:b w:val="0"/>
+          <w:color w:val="1B2C3B"/>
+          <w:sz w:val="21"/>
+          <w:lang w:val="en-US" w:bidi="en-US"/>
         </w:rPr>
-        <w:t>Research activity | Research Center, Islamic Azad University, Karaj | 1.5 years</w:t>
+        <w:t>• Built a Persian travel chatbot with three WordPress plugins.</w:t>
       </w:r>
     </w:p>
     <w:p>
@@ -136,9 +180,13 @@
       </w:pPr>
       <w:r>
         <w:rPr>
-          <w:sz w:val="18"/>
+          <w:rFonts w:ascii="Arial" w:hAnsi="Arial" w:cs="Arial"/>
+          <w:b w:val="0"/>
+          <w:color w:val="1B2C3B"/>
+          <w:sz w:val="21"/>
+          <w:lang w:val="en-US" w:bidi="en-US"/>
         </w:rPr>
-        <w:t>Active in research activities at the university research center.</w:t>
+        <w:t>• Developed a bot to check competitor prices.</w:t>
       </w:r>
     </w:p>
     <w:p>
@@ -147,8 +195,28 @@
       </w:pPr>
       <w:r>
         <w:rPr>
-          <w:sz w:val="18"/>
+          <w:rFonts w:ascii="Arial" w:hAnsi="Arial" w:cs="Arial"/>
+          <w:b w:val="0"/>
+          <w:color w:val="1B2C3B"/>
+          <w:sz w:val="21"/>
+          <w:lang w:val="en-US" w:bidi="en-US"/>
         </w:rPr>
+        <w:t>• Created an operator training dashboard and a custom homepage theme for Parsegasht.</w:t>
+      </w:r>
+    </w:p>
+    <w:p>
+      <w:pPr>
+        <w:pStyle w:val="Heading1"/>
+      </w:pPr>
+      <w:r>
+        <w:rPr>
+          <w:rFonts w:ascii="Arial" w:hAnsi="Arial" w:cs="Arial"/>
+          <w:b/>
+          <w:color w:val="1B2C3B"/>
+          <w:sz w:val="23"/>
+          <w:lang w:val="en-US" w:bidi="en-US"/>
+        </w:rPr>
+        <w:t>Entrepreneurial experience</w:t>
       </w:r>
     </w:p>
     <w:p>
@@ -157,9 +225,23 @@
       </w:pPr>
       <w:r>
         <w:rPr>
-          <w:sz w:val="18"/>
+          <w:rFonts w:ascii="Arial" w:hAnsi="Arial" w:cs="Arial"/>
+          <w:b/>
+          <w:color w:val="1B2C3B"/>
+          <w:sz w:val="21"/>
+          <w:lang w:val="en-US" w:bidi="en-US"/>
         </w:rPr>
-        <w:t>Software Instructor | Faculty of Work and Skills, Islamic Azad University, Karaj | 1 year</w:t>
+        <w:t>Co-founder</w:t>
+      </w:r>
+      <w:r>
+        <w:rPr>
+          <w:rFonts w:ascii="Arial" w:hAnsi="Arial" w:cs="Arial"/>
+          <w:b w:val="0"/>
+          <w:color w:val="1B2C3B"/>
+          <w:sz w:val="21"/>
+          <w:lang w:val="en-US" w:bidi="en-US"/>
+        </w:rPr>
+        <w:t xml:space="preserve"> | Fidar Technology Fartak | 1.5 years</w:t>
       </w:r>
     </w:p>
     <w:p>
@@ -168,9 +250,28 @@
       </w:pPr>
       <w:r>
         <w:rPr>
-          <w:sz w:val="18"/>
+          <w:rFonts w:ascii="Arial" w:hAnsi="Arial" w:cs="Arial"/>
+          <w:b w:val="0"/>
+          <w:color w:val="1B2C3B"/>
+          <w:sz w:val="21"/>
+          <w:lang w:val="en-US" w:bidi="en-US"/>
         </w:rPr>
-        <w:t>Programming Instructor | Net College Institute | 1 year</w:t>
+        <w:t>The project explored games informed by psychology, with the aim of helping to prevent crime. It remained a university project and was not formally incorporated.</w:t>
+      </w:r>
+    </w:p>
+    <w:p>
+      <w:pPr>
+        <w:pStyle w:val="Heading1"/>
+      </w:pPr>
+      <w:r>
+        <w:rPr>
+          <w:rFonts w:ascii="Arial" w:hAnsi="Arial" w:cs="Arial"/>
+          <w:b/>
+          <w:color w:val="1B2C3B"/>
+          <w:sz w:val="23"/>
+          <w:lang w:val="en-US" w:bidi="en-US"/>
+        </w:rPr>
+        <w:t>Selected projects</w:t>
       </w:r>
     </w:p>
     <w:p>
@@ -179,17 +280,23 @@
       </w:pPr>
       <w:r>
         <w:rPr>
-          <w:sz w:val="18"/>
+          <w:rFonts w:ascii="Arial" w:hAnsi="Arial" w:cs="Arial"/>
+          <w:b/>
+          <w:color w:val="1B2C3B"/>
+          <w:sz w:val="21"/>
+          <w:lang w:val="en-US" w:bidi="en-US"/>
         </w:rPr>
-        <w:t>Robotics Instructor | Mohandesin Bartar Institute | 1 year</w:t>
+        <w:t>PyLipExtractor</w:t>
       </w:r>
-    </w:p>
-    <w:p>
-      <w:pPr>
-        <w:pStyle w:val="Heading1"/>
-      </w:pPr>
       <w:r>
-        <w:t>ENTREPRENEURIAL EXPERIENCE</w:t>
+        <w:rPr>
+          <w:rFonts w:ascii="Arial" w:hAnsi="Arial" w:cs="Arial"/>
+          <w:b w:val="0"/>
+          <w:color w:val="1B2C3B"/>
+          <w:sz w:val="21"/>
+          <w:lang w:val="en-US" w:bidi="en-US"/>
+        </w:rPr>
+        <w:t xml:space="preserve"> | Python package for extracting lip regions from video with MediaPipe, temporal smoothing and configurable CPU/CUDA processing.</w:t>
       </w:r>
     </w:p>
     <w:p>
@@ -198,9 +305,13 @@
       </w:pPr>
       <w:r>
         <w:rPr>
-          <w:sz w:val="18"/>
+          <w:rFonts w:ascii="Arial" w:hAnsi="Arial" w:cs="Arial"/>
+          <w:b w:val="0"/>
+          <w:color w:val="1B2C3B"/>
+          <w:sz w:val="21"/>
+          <w:lang w:val="en-US" w:bidi="en-US"/>
         </w:rPr>
-        <w:t>Co-founder and sole programmer | Fidar Technology Fartak — university-level venture, not incorporated | 1.5 years</w:t>
+        <w:t>https://github.com/MehradYaghoubi/pylipextractor</w:t>
       </w:r>
     </w:p>
     <w:p>
@@ -209,17 +320,23 @@
       </w:pPr>
       <w:r>
         <w:rPr>
-          <w:sz w:val="18"/>
+          <w:rFonts w:ascii="Arial" w:hAnsi="Arial" w:cs="Arial"/>
+          <w:b/>
+          <w:color w:val="1B2C3B"/>
+          <w:sz w:val="21"/>
+          <w:lang w:val="en-US" w:bidi="en-US"/>
         </w:rPr>
-        <w:t>One of three core team members and the only programmer, working on psychology-informed games intended to help prevent crime.</w:t>
+        <w:t>OCR tool</w:t>
       </w:r>
-    </w:p>
-    <w:p>
-      <w:pPr>
-        <w:pStyle w:val="Heading1"/>
-      </w:pPr>
       <w:r>
-        <w:t>SELECTED PROJECTS</w:t>
+        <w:rPr>
+          <w:rFonts w:ascii="Arial" w:hAnsi="Arial" w:cs="Arial"/>
+          <w:b w:val="0"/>
+          <w:color w:val="1B2C3B"/>
+          <w:sz w:val="21"/>
+          <w:lang w:val="en-US" w:bidi="en-US"/>
+        </w:rPr>
+        <w:t xml:space="preserve"> | Text recognition using an external API.</w:t>
       </w:r>
     </w:p>
     <w:p>
@@ -228,9 +345,38 @@
       </w:pPr>
       <w:r>
         <w:rPr>
-          <w:sz w:val="18"/>
+          <w:rFonts w:ascii="Arial" w:hAnsi="Arial" w:cs="Arial"/>
+          <w:b/>
+          <w:color w:val="1B2C3B"/>
+          <w:sz w:val="21"/>
+          <w:lang w:val="en-US" w:bidi="en-US"/>
         </w:rPr>
-        <w:t>PyLipExtractor | Open-source Python package to extract stable lip regions from video using MediaPipe; includes temporal smoothing and configurable CPU/CUDA processing. github.com/MehradYaghoubi/pylipextractor</w:t>
+        <w:t>Personal RAG chatbot</w:t>
+      </w:r>
+      <w:r>
+        <w:rPr>
+          <w:rFonts w:ascii="Arial" w:hAnsi="Arial" w:cs="Arial"/>
+          <w:b w:val="0"/>
+          <w:color w:val="1B2C3B"/>
+          <w:sz w:val="21"/>
+          <w:lang w:val="en-US" w:bidi="en-US"/>
+        </w:rPr>
+        <w:t xml:space="preserve"> | In development.</w:t>
+      </w:r>
+    </w:p>
+    <w:p>
+      <w:pPr>
+        <w:pStyle w:val="Heading1"/>
+      </w:pPr>
+      <w:r>
+        <w:rPr>
+          <w:rFonts w:ascii="Arial" w:hAnsi="Arial" w:cs="Arial"/>
+          <w:b/>
+          <w:color w:val="1B2C3B"/>
+          <w:sz w:val="23"/>
+          <w:lang w:val="en-US" w:bidi="en-US"/>
+        </w:rPr>
+        <w:t>Research and teaching</w:t>
       </w:r>
     </w:p>
     <w:p>
@@ -239,8 +385,23 @@
       </w:pPr>
       <w:r>
         <w:rPr>
-          <w:sz w:val="18"/>
+          <w:rFonts w:ascii="Arial" w:hAnsi="Arial" w:cs="Arial"/>
+          <w:b/>
+          <w:color w:val="1B2C3B"/>
+          <w:sz w:val="21"/>
+          <w:lang w:val="en-US" w:bidi="en-US"/>
         </w:rPr>
+        <w:t>University research</w:t>
+      </w:r>
+      <w:r>
+        <w:rPr>
+          <w:rFonts w:ascii="Arial" w:hAnsi="Arial" w:cs="Arial"/>
+          <w:b w:val="0"/>
+          <w:color w:val="1B2C3B"/>
+          <w:sz w:val="21"/>
+          <w:lang w:val="en-US" w:bidi="en-US"/>
+        </w:rPr>
+        <w:t xml:space="preserve"> | Research Center, Islamic Azad University, Karaj | 1.5 years</w:t>
       </w:r>
     </w:p>
     <w:p>
@@ -249,9 +410,23 @@
       </w:pPr>
       <w:r>
         <w:rPr>
-          <w:sz w:val="18"/>
+          <w:rFonts w:ascii="Arial" w:hAnsi="Arial" w:cs="Arial"/>
+          <w:b/>
+          <w:color w:val="1B2C3B"/>
+          <w:sz w:val="21"/>
+          <w:lang w:val="en-US" w:bidi="en-US"/>
         </w:rPr>
-        <w:t>API-based OCR tool | Built a text-recognition tool using an external API.</w:t>
+        <w:t>Software Instructor</w:t>
+      </w:r>
+      <w:r>
+        <w:rPr>
+          <w:rFonts w:ascii="Arial" w:hAnsi="Arial" w:cs="Arial"/>
+          <w:b w:val="0"/>
+          <w:color w:val="1B2C3B"/>
+          <w:sz w:val="21"/>
+          <w:lang w:val="en-US" w:bidi="en-US"/>
+        </w:rPr>
+        <w:t xml:space="preserve"> | Faculty of Work and Skills, Islamic Azad University, Karaj | 1 year</w:t>
       </w:r>
     </w:p>
     <w:p>
@@ -260,8 +435,23 @@
       </w:pPr>
       <w:r>
         <w:rPr>
-          <w:sz w:val="18"/>
+          <w:rFonts w:ascii="Arial" w:hAnsi="Arial" w:cs="Arial"/>
+          <w:b/>
+          <w:color w:val="1B2C3B"/>
+          <w:sz w:val="21"/>
+          <w:lang w:val="en-US" w:bidi="en-US"/>
         </w:rPr>
+        <w:t>Programming Instructor</w:t>
+      </w:r>
+      <w:r>
+        <w:rPr>
+          <w:rFonts w:ascii="Arial" w:hAnsi="Arial" w:cs="Arial"/>
+          <w:b w:val="0"/>
+          <w:color w:val="1B2C3B"/>
+          <w:sz w:val="21"/>
+          <w:lang w:val="en-US" w:bidi="en-US"/>
+        </w:rPr>
+        <w:t xml:space="preserve"> | Net College Institute | 1 year</w:t>
       </w:r>
     </w:p>
     <w:p>
@@ -270,9 +460,23 @@
       </w:pPr>
       <w:r>
         <w:rPr>
-          <w:sz w:val="18"/>
+          <w:rFonts w:ascii="Arial" w:hAnsi="Arial" w:cs="Arial"/>
+          <w:b/>
+          <w:color w:val="1B2C3B"/>
+          <w:sz w:val="21"/>
+          <w:lang w:val="en-US" w:bidi="en-US"/>
         </w:rPr>
-        <w:t>Personal RAG chatbot | In development.</w:t>
+        <w:t>Robotics Instructor</w:t>
+      </w:r>
+      <w:r>
+        <w:rPr>
+          <w:rFonts w:ascii="Arial" w:hAnsi="Arial" w:cs="Arial"/>
+          <w:b w:val="0"/>
+          <w:color w:val="1B2C3B"/>
+          <w:sz w:val="21"/>
+          <w:lang w:val="en-US" w:bidi="en-US"/>
+        </w:rPr>
+        <w:t xml:space="preserve"> | Mohandesin Bartar Institute | 1 year</w:t>
       </w:r>
     </w:p>
     <w:p>
@@ -280,7 +484,14 @@
         <w:pStyle w:val="Heading1"/>
       </w:pPr>
       <w:r>
-        <w:t>TECHNICAL SKILLS</w:t>
+        <w:rPr>
+          <w:rFonts w:ascii="Arial" w:hAnsi="Arial" w:cs="Arial"/>
+          <w:b/>
+          <w:color w:val="1B2C3B"/>
+          <w:sz w:val="23"/>
+          <w:lang w:val="en-US" w:bidi="en-US"/>
+        </w:rPr>
+        <w:t>Education</w:t>
       </w:r>
     </w:p>
     <w:p>
@@ -289,17 +500,23 @@
       </w:pPr>
       <w:r>
         <w:rPr>
-          <w:sz w:val="18"/>
+          <w:rFonts w:ascii="Arial" w:hAnsi="Arial" w:cs="Arial"/>
+          <w:b/>
+          <w:color w:val="1B2C3B"/>
+          <w:sz w:val="21"/>
+          <w:lang w:val="en-US" w:bidi="en-US"/>
         </w:rPr>
-        <w:t>Python; PyTorch; TorchVision; OpenCV; MediaPipe; FastAPI; REST APIs; WordPress; Git; Linux; NumPy; Pandas; scikit-learn.</w:t>
+        <w:t>M.Sc. in Artificial Intelligence</w:t>
       </w:r>
-    </w:p>
-    <w:p>
-      <w:pPr>
-        <w:pStyle w:val="Heading1"/>
-      </w:pPr>
       <w:r>
-        <w:t>EDUCATION</w:t>
+        <w:rPr>
+          <w:rFonts w:ascii="Arial" w:hAnsi="Arial" w:cs="Arial"/>
+          <w:b w:val="0"/>
+          <w:color w:val="1B2C3B"/>
+          <w:sz w:val="21"/>
+          <w:lang w:val="en-US" w:bidi="en-US"/>
+        </w:rPr>
+        <w:t xml:space="preserve"> | Islamic Azad University, Karaj</w:t>
       </w:r>
     </w:p>
     <w:p>
@@ -308,9 +525,23 @@
       </w:pPr>
       <w:r>
         <w:rPr>
-          <w:sz w:val="18"/>
+          <w:rFonts w:ascii="Arial" w:hAnsi="Arial" w:cs="Arial"/>
+          <w:b/>
+          <w:color w:val="1B2C3B"/>
+          <w:sz w:val="21"/>
+          <w:lang w:val="en-US" w:bidi="en-US"/>
         </w:rPr>
-        <w:t>M.Sc. in Artificial Intelligence | Islamic Azad University, Karaj | 2024–2026 (expected) | GPA: 18.45/20</w:t>
+        <w:t>2024 to 2026 (expected), preparing for thesis defense</w:t>
+      </w:r>
+      <w:r>
+        <w:rPr>
+          <w:rFonts w:ascii="Arial" w:hAnsi="Arial" w:cs="Arial"/>
+          <w:b w:val="0"/>
+          <w:color w:val="1B2C3B"/>
+          <w:sz w:val="21"/>
+          <w:lang w:val="en-US" w:bidi="en-US"/>
+        </w:rPr>
+        <w:t xml:space="preserve"> | GPA: 18.45/20</w:t>
       </w:r>
     </w:p>
     <w:p>
@@ -319,17 +550,13 @@
       </w:pPr>
       <w:r>
         <w:rPr>
-          <w:sz w:val="18"/>
+          <w:rFonts w:ascii="Arial" w:hAnsi="Arial" w:cs="Arial"/>
+          <w:b w:val="0"/>
+          <w:color w:val="1B2C3B"/>
+          <w:sz w:val="21"/>
+          <w:lang w:val="en-US" w:bidi="en-US"/>
         </w:rPr>
-        <w:t>B.Sc. in Computer Science (Software Engineering) | Islamic Azad University, Karaj | 2017–2023 | GPA: 14.68/20</w:t>
-      </w:r>
-    </w:p>
-    <w:p>
-      <w:pPr>
-        <w:pStyle w:val="Heading1"/>
-      </w:pPr>
-      <w:r>
-        <w:t>RESEARCH</w:t>
+        <w:t>Thesis: improving lip-reading accuracy with deep neural networks.</w:t>
       </w:r>
     </w:p>
     <w:p>
@@ -338,17 +565,23 @@
       </w:pPr>
       <w:r>
         <w:rPr>
-          <w:sz w:val="18"/>
+          <w:rFonts w:ascii="Arial" w:hAnsi="Arial" w:cs="Arial"/>
+          <w:b/>
+          <w:color w:val="1B2C3B"/>
+          <w:sz w:val="21"/>
+          <w:lang w:val="en-US" w:bidi="en-US"/>
         </w:rPr>
-        <w:t>Visual speech recognition (VSR), efficient deep learning, model inference and knowledge distillation. One manuscript under review at The Visual Computer; one arXiv preprint.</w:t>
+        <w:t>B.Sc. in Computer Science (Software Engineering)</w:t>
       </w:r>
-    </w:p>
-    <w:p>
-      <w:pPr>
-        <w:pStyle w:val="Heading1"/>
-      </w:pPr>
       <w:r>
-        <w:t>LANGUAGES</w:t>
+        <w:rPr>
+          <w:rFonts w:ascii="Arial" w:hAnsi="Arial" w:cs="Arial"/>
+          <w:b w:val="0"/>
+          <w:color w:val="1B2C3B"/>
+          <w:sz w:val="21"/>
+          <w:lang w:val="en-US" w:bidi="en-US"/>
+        </w:rPr>
+        <w:t xml:space="preserve"> | Islamic Azad University, Karaj</w:t>
       </w:r>
     </w:p>
     <w:p>
@@ -357,19 +590,127 @@
       </w:pPr>
       <w:r>
         <w:rPr>
-          <w:sz w:val="18"/>
+          <w:rFonts w:ascii="Arial" w:hAnsi="Arial" w:cs="Arial"/>
+          <w:b/>
+          <w:color w:val="1B2C3B"/>
+          <w:sz w:val="21"/>
+          <w:lang w:val="en-US" w:bidi="en-US"/>
         </w:rPr>
-        <w:t>Persian (native); English (B1).</w:t>
+        <w:t>2017 to 2023</w:t>
+      </w:r>
+      <w:r>
+        <w:rPr>
+          <w:rFonts w:ascii="Arial" w:hAnsi="Arial" w:cs="Arial"/>
+          <w:b w:val="0"/>
+          <w:color w:val="1B2C3B"/>
+          <w:sz w:val="21"/>
+          <w:lang w:val="en-US" w:bidi="en-US"/>
+        </w:rPr>
+        <w:t xml:space="preserve"> | GPA: 14.68/20</w:t>
+      </w:r>
+    </w:p>
+    <w:p>
+      <w:pPr>
+        <w:pStyle w:val="Heading1"/>
+      </w:pPr>
+      <w:r>
+        <w:rPr>
+          <w:rFonts w:ascii="Arial" w:hAnsi="Arial" w:cs="Arial"/>
+          <w:b/>
+          <w:color w:val="1B2C3B"/>
+          <w:sz w:val="23"/>
+          <w:lang w:val="en-US" w:bidi="en-US"/>
+        </w:rPr>
+        <w:t>Research</w:t>
+      </w:r>
+    </w:p>
+    <w:p>
+      <w:pPr>
+        <w:keepLines/>
+      </w:pPr>
+      <w:r>
+        <w:rPr>
+          <w:rFonts w:ascii="Arial" w:hAnsi="Arial" w:cs="Arial"/>
+          <w:b w:val="0"/>
+          <w:color w:val="1B2C3B"/>
+          <w:sz w:val="21"/>
+          <w:lang w:val="en-US" w:bidi="en-US"/>
+        </w:rPr>
+        <w:t>Research on VSR, efficient inference and knowledge distillation. One VSR manuscript is under review at The Visual Computer. A second paper on decision making in Go is an arXiv preprint.</w:t>
+      </w:r>
+    </w:p>
+    <w:p>
+      <w:pPr>
+        <w:pStyle w:val="Heading1"/>
+      </w:pPr>
+      <w:r>
+        <w:rPr>
+          <w:rFonts w:ascii="Arial" w:hAnsi="Arial" w:cs="Arial"/>
+          <w:b/>
+          <w:color w:val="1B2C3B"/>
+          <w:sz w:val="23"/>
+          <w:lang w:val="en-US" w:bidi="en-US"/>
+        </w:rPr>
+        <w:t>Languages</w:t>
+      </w:r>
+    </w:p>
+    <w:p>
+      <w:pPr>
+        <w:keepLines/>
+      </w:pPr>
+      <w:r>
+        <w:rPr>
+          <w:rFonts w:ascii="Arial" w:hAnsi="Arial" w:cs="Arial"/>
+          <w:b w:val="0"/>
+          <w:color w:val="1B2C3B"/>
+          <w:sz w:val="21"/>
+          <w:lang w:val="en-US" w:bidi="en-US"/>
+        </w:rPr>
+        <w:t>Persian (native), English (B1).</w:t>
       </w:r>
     </w:p>
     <w:sectPr>
-      <w:pgSz w:w="12240" w:h="15840"/>
-      <w:pgMar w:top="792" w:right="1037" w:bottom="792" w:left="1037" w:header="720" w:footer="720" w:gutter="0"/>
+      <w:footerReference w:type="default" r:id="rId9"/>
+      <w:pgSz w:w="11909" w:h="16834"/>
+      <w:pgMar w:top="835" w:right="979" w:bottom="835" w:left="979" w:header="720" w:footer="720" w:gutter="0"/>
       <w:cols w:space="720"/>
       <w:docGrid w:linePitch="360"/>
     </w:sectPr>
   </w:body>
 </w:document>
+</file>
+
+<file path=word/footer1.xml><?xml version="1.0" encoding="utf-8"?>
+<w:ftr xmlns:m="http://schemas.openxmlformats.org/officeDocument/2006/math" xmlns:mc="http://schemas.openxmlformats.org/markup-compatibility/2006" xmlns:mo="http://schemas.microsoft.com/office/mac/office/2008/main" xmlns:mv="urn:schemas-microsoft-com:mac:vml" xmlns:o="urn:schemas-microsoft-com:office:office" xmlns:r="http://schemas.openxmlformats.org/officeDocument/2006/relationships" xmlns:v="urn:schemas-microsoft-com:vml" xmlns:w10="urn:schemas-microsoft-com:office:word" xmlns:w14="http://schemas.microsoft.com/office/word/2010/wordml" xmlns:w="http://schemas.openxmlformats.org/wordprocessingml/2006/main" xmlns:wne="http://schemas.microsoft.com/office/word/2006/wordml" xmlns:wp14="http://schemas.microsoft.com/office/word/2010/wordprocessingDrawing" xmlns:wp="http://schemas.openxmlformats.org/drawingml/2006/wordprocessingDrawing" xmlns:wpc="http://schemas.microsoft.com/office/word/2010/wordprocessingCanvas" xmlns:wpg="http://schemas.microsoft.com/office/word/2010/wordprocessingGroup" xmlns:wpi="http://schemas.microsoft.com/office/word/2010/wordprocessingInk" xmlns:wps="http://schemas.microsoft.com/office/word/2010/wordprocessingShape" mc:Ignorable="w14 wp14">
+  <w:p>
+    <w:pPr>
+      <w:pStyle w:val="Footer"/>
+      <w:jc w:val="center"/>
+    </w:pPr>
+    <w:r>
+      <w:rPr>
+        <w:rFonts w:ascii="Arial" w:hAnsi="Arial" w:cs="Arial"/>
+        <w:b w:val="0"/>
+        <w:color w:val="1B2C3B"/>
+        <w:sz w:val="16"/>
+        <w:lang w:val="en-US" w:bidi="en-US"/>
+      </w:rPr>
+      <w:t xml:space="preserve">Mehrad Yaghoubi | </w:t>
+    </w:r>
+    <w:fldSimple w:instr="PAGE"/>
+    <w:r>
+      <w:rPr>
+        <w:rFonts w:ascii="Arial" w:hAnsi="Arial" w:cs="Arial"/>
+        <w:b w:val="0"/>
+        <w:color w:val="1B2C3B"/>
+        <w:sz w:val="16"/>
+        <w:lang w:val="en-US" w:bidi="en-US"/>
+      </w:rPr>
+      <w:t xml:space="preserve"> / </w:t>
+    </w:r>
+    <w:fldSimple w:instr="NUMPAGES"/>
+  </w:p>
+</w:ftr>
 </file>
 
 <file path=word/numbering.xml><?xml version="1.0" encoding="utf-8"?>
@@ -736,12 +1077,12 @@
     <w:qFormat/>
     <w:rsid w:val="00FC693F"/>
     <w:pPr>
-      <w:spacing w:after="60" w:line="250" w:lineRule="auto"/>
+      <w:widowControl/>
+      <w:spacing w:line="259" w:lineRule="auto" w:after="40"/>
     </w:pPr>
     <w:rPr>
       <w:rFonts w:ascii="Arial" w:hAnsi="Arial"/>
-      <w:color w:val="293742"/>
-      <w:sz w:val="18"/>
+      <w:sz w:val="21"/>
     </w:rPr>
   </w:style>
   <w:style w:type="paragraph" w:styleId="Header">
@@ -799,15 +1140,15 @@
     <w:pPr>
       <w:keepNext/>
       <w:keepLines/>
-      <w:spacing w:before="160" w:after="60"/>
+      <w:spacing w:before="120" w:after="80"/>
       <w:outlineLvl w:val="0"/>
     </w:pPr>
     <w:rPr>
       <w:rFonts w:asciiTheme="majorHAnsi" w:eastAsiaTheme="majorEastAsia" w:hAnsiTheme="majorHAnsi" w:cstheme="majorBidi" w:ascii="Arial" w:hAnsi="Arial"/>
       <w:b/>
       <w:bCs/>
-      <w:color w:val="153A50"/>
-      <w:sz w:val="21"/>
+      <w:color w:val="000000"/>
+      <w:sz w:val="23"/>
       <w:szCs w:val="28"/>
     </w:rPr>
   </w:style>
@@ -1085,19 +1426,15 @@
     <w:qFormat/>
     <w:rsid w:val="00FC693F"/>
     <w:pPr>
-      <w:pBdr>
-        <w:bottom w:val="single" w:sz="8" w:space="4" w:color="4F81BD" w:themeColor="accent1"/>
-      </w:pBdr>
-      <w:spacing w:after="300" w:line="240" w:lineRule="auto"/>
+      <w:spacing w:after="80" w:line="240" w:lineRule="auto"/>
       <w:contextualSpacing/>
     </w:pPr>
     <w:rPr>
       <w:rFonts w:asciiTheme="majorHAnsi" w:eastAsiaTheme="majorEastAsia" w:hAnsiTheme="majorHAnsi" w:cstheme="majorBidi" w:ascii="Arial" w:hAnsi="Arial"/>
-      <w:b/>
-      <w:color w:val="153A50"/>
+      <w:color w:val="000000"/>
       <w:spacing w:val="5"/>
       <w:kern w:val="28"/>
-      <w:sz w:val="48"/>
+      <w:sz w:val="46"/>
       <w:szCs w:val="52"/>
     </w:rPr>
   </w:style>

</xml_diff>